<commit_message>
docs: update README.md and add lab report docx
</commit_message>
<xml_diff>
--- a/Філяс Максим_Лаб06_V3.docx
+++ b/Філяс Максим_Лаб06_V3.docx
@@ -30696,13 +30696,517 @@
     </w:p>
     <w:p>
       <w:pPr>
-        <w:ind w:firstLine="708"/>
-        <w:rPr>
-          <w:sz w:val="17"/>
-          <w:szCs w:val="17"/>
-          <w:lang w:val="uk-UA"/>
-        </w:rPr>
-      </w:pPr>
+        <w:pStyle w:val="2"/>
+        <w:rPr>
+          <w:lang w:val="uk-UA"/>
+        </w:rPr>
+      </w:pPr>
+      <w:r>
+        <w:t>4.</w:t>
+      </w:r>
+      <w:r>
+        <w:rPr>
+          <w:lang w:val="uk-UA"/>
+        </w:rPr>
+        <w:t>1</w:t>
+      </w:r>
+      <w:r>
+        <w:rPr>
+          <w:lang w:val="uk-UA"/>
+        </w:rPr>
+        <w:t>3</w:t>
+      </w:r>
+      <w:r>
+        <w:t>.</w:t>
+      </w:r>
+      <w:r>
+        <w:rPr>
+          <w:lang w:val="uk-UA"/>
+        </w:rPr>
+        <w:t xml:space="preserve"> </w:t>
+      </w:r>
+      <w:r>
+        <w:rPr>
+          <w:lang w:val="uk-UA"/>
+        </w:rPr>
+        <w:t>README.md</w:t>
+      </w:r>
+    </w:p>
+    <w:p>
+      <w:pPr>
+        <w:rPr>
+          <w:lang w:val="uk-UA"/>
+        </w:rPr>
+      </w:pPr>
+      <w:r>
+        <w:rPr>
+          <w:lang w:val="uk-UA"/>
+        </w:rPr>
+        <w:t># Lab 06: Automated Testing for E-Commerce System (Variant 3)</w:t>
+      </w:r>
+    </w:p>
+    <w:p>
+      <w:pPr>
+        <w:rPr>
+          <w:lang w:val="uk-UA"/>
+        </w:rPr>
+      </w:pPr>
+    </w:p>
+    <w:p>
+      <w:pPr>
+        <w:rPr>
+          <w:lang w:val="uk-UA"/>
+        </w:rPr>
+      </w:pPr>
+      <w:r>
+        <w:rPr>
+          <w:lang w:val="uk-UA"/>
+        </w:rPr>
+        <w:t>Проєкт містить доменну модель, бізнес-логіку та повноцінний набір автоматизованих тестів (`pytest`) для системи «Інтернет-магазин» (E-Commerce Processing System).</w:t>
+      </w:r>
+    </w:p>
+    <w:p>
+      <w:pPr>
+        <w:rPr>
+          <w:lang w:val="uk-UA"/>
+        </w:rPr>
+      </w:pPr>
+    </w:p>
+    <w:p>
+      <w:pPr>
+        <w:rPr>
+          <w:lang w:val="uk-UA"/>
+        </w:rPr>
+      </w:pPr>
+      <w:r>
+        <w:rPr>
+          <w:lang w:val="uk-UA"/>
+        </w:rPr>
+        <w:t xml:space="preserve">## </w:t>
+      </w:r>
+      <w:r>
+        <w:rPr>
+          <w:rFonts w:ascii="Segoe UI Emoji" w:hAnsi="Segoe UI Emoji" w:cs="Segoe UI Emoji"/>
+          <w:lang w:val="uk-UA"/>
+        </w:rPr>
+        <w:t>📁</w:t>
+      </w:r>
+      <w:r>
+        <w:rPr>
+          <w:lang w:val="uk-UA"/>
+        </w:rPr>
+        <w:t xml:space="preserve"> Структура проєкту</w:t>
+      </w:r>
+    </w:p>
+    <w:p>
+      <w:pPr>
+        <w:rPr>
+          <w:lang w:val="uk-UA"/>
+        </w:rPr>
+      </w:pPr>
+    </w:p>
+    <w:p>
+      <w:pPr>
+        <w:rPr>
+          <w:lang w:val="uk-UA"/>
+        </w:rPr>
+      </w:pPr>
+      <w:r>
+        <w:rPr>
+          <w:lang w:val="uk-UA"/>
+        </w:rPr>
+        <w:t>- `src/application/` — основний код застосунку:</w:t>
+      </w:r>
+    </w:p>
+    <w:p>
+      <w:pPr>
+        <w:rPr>
+          <w:lang w:val="uk-UA"/>
+        </w:rPr>
+      </w:pPr>
+      <w:r>
+        <w:rPr>
+          <w:lang w:val="uk-UA"/>
+        </w:rPr>
+        <w:t xml:space="preserve">  - `models.py` — доменні сутності (`Product`), винятки (`InvalidProductDataError`, `ProductNotFoundError`).</w:t>
+      </w:r>
+    </w:p>
+    <w:p>
+      <w:pPr>
+        <w:rPr>
+          <w:lang w:val="uk-UA"/>
+        </w:rPr>
+      </w:pPr>
+      <w:r>
+        <w:rPr>
+          <w:lang w:val="uk-UA"/>
+        </w:rPr>
+        <w:t xml:space="preserve">  - `config.py` — налаштування середовища та конфігурація валідації.</w:t>
+      </w:r>
+    </w:p>
+    <w:p>
+      <w:pPr>
+        <w:rPr>
+          <w:lang w:val="uk-UA"/>
+        </w:rPr>
+      </w:pPr>
+      <w:r>
+        <w:rPr>
+          <w:lang w:val="uk-UA"/>
+        </w:rPr>
+        <w:t xml:space="preserve">  - `repositories.py` — універсальне сховище даних у пам'яті (`InMemoryRepository`).</w:t>
+      </w:r>
+    </w:p>
+    <w:p>
+      <w:pPr>
+        <w:rPr>
+          <w:lang w:val="uk-UA"/>
+        </w:rPr>
+      </w:pPr>
+      <w:r>
+        <w:rPr>
+          <w:lang w:val="uk-UA"/>
+        </w:rPr>
+        <w:t xml:space="preserve">  - `services.py` — бізнес-логіка (пошук, фільтрація, розрахунок вартості) та асинхронні виклики.</w:t>
+      </w:r>
+    </w:p>
+    <w:p>
+      <w:pPr>
+        <w:rPr>
+          <w:lang w:val="uk-UA"/>
+        </w:rPr>
+      </w:pPr>
+      <w:r>
+        <w:rPr>
+          <w:lang w:val="uk-UA"/>
+        </w:rPr>
+        <w:lastRenderedPageBreak/>
+        <w:t xml:space="preserve">  - `exporters.py` — імпорт та експорт даних у формати CSV та JSON.</w:t>
+      </w:r>
+    </w:p>
+    <w:p>
+      <w:pPr>
+        <w:rPr>
+          <w:lang w:val="uk-UA"/>
+        </w:rPr>
+      </w:pPr>
+      <w:r>
+        <w:rPr>
+          <w:lang w:val="uk-UA"/>
+        </w:rPr>
+        <w:t>- `tests/` — набір автоматизованих тестів:</w:t>
+      </w:r>
+    </w:p>
+    <w:p>
+      <w:pPr>
+        <w:rPr>
+          <w:lang w:val="uk-UA"/>
+        </w:rPr>
+      </w:pPr>
+      <w:r>
+        <w:rPr>
+          <w:lang w:val="uk-UA"/>
+        </w:rPr>
+        <w:t xml:space="preserve">  - `conftest.py` — спільні фікстури Pytest (`sample_products`, `empty_catalog`, `product_repository`).</w:t>
+      </w:r>
+    </w:p>
+    <w:p>
+      <w:pPr>
+        <w:rPr>
+          <w:lang w:val="uk-UA"/>
+        </w:rPr>
+      </w:pPr>
+      <w:r>
+        <w:rPr>
+          <w:lang w:val="uk-UA"/>
+        </w:rPr>
+        <w:t xml:space="preserve">  - `unit/` — модульні тести моделей, валідаторів та сервісів (`Mock`, `AsyncMock`).</w:t>
+      </w:r>
+    </w:p>
+    <w:p>
+      <w:pPr>
+        <w:rPr>
+          <w:lang w:val="uk-UA"/>
+        </w:rPr>
+      </w:pPr>
+      <w:r>
+        <w:rPr>
+          <w:lang w:val="uk-UA"/>
+        </w:rPr>
+        <w:t xml:space="preserve">  - `integration/` — інтеграційні тести конфігурації (`monkeypatch`) та файлового імпорту/експорту (`tmp_path`).</w:t>
+      </w:r>
+    </w:p>
+    <w:p>
+      <w:pPr>
+        <w:rPr>
+          <w:lang w:val="uk-UA"/>
+        </w:rPr>
+      </w:pPr>
+    </w:p>
+    <w:p>
+      <w:pPr>
+        <w:rPr>
+          <w:lang w:val="uk-UA"/>
+        </w:rPr>
+      </w:pPr>
+      <w:r>
+        <w:rPr>
+          <w:lang w:val="uk-UA"/>
+        </w:rPr>
+        <w:t xml:space="preserve">## </w:t>
+      </w:r>
+      <w:r>
+        <w:rPr>
+          <w:rFonts w:ascii="Segoe UI Emoji" w:hAnsi="Segoe UI Emoji" w:cs="Segoe UI Emoji"/>
+          <w:lang w:val="uk-UA"/>
+        </w:rPr>
+        <w:t>🚀</w:t>
+      </w:r>
+      <w:r>
+        <w:rPr>
+          <w:lang w:val="uk-UA"/>
+        </w:rPr>
+        <w:t xml:space="preserve"> Налаштування та запуск</w:t>
+      </w:r>
+    </w:p>
+    <w:p>
+      <w:pPr>
+        <w:rPr>
+          <w:lang w:val="uk-UA"/>
+        </w:rPr>
+      </w:pPr>
+    </w:p>
+    <w:p>
+      <w:pPr>
+        <w:rPr>
+          <w:lang w:val="uk-UA"/>
+        </w:rPr>
+      </w:pPr>
+      <w:r>
+        <w:rPr>
+          <w:lang w:val="uk-UA"/>
+        </w:rPr>
+        <w:t>### 1. Створення та активація віртуального середовища</w:t>
+      </w:r>
+    </w:p>
+    <w:p>
+      <w:pPr>
+        <w:rPr>
+          <w:lang w:val="uk-UA"/>
+        </w:rPr>
+      </w:pPr>
+      <w:r>
+        <w:rPr>
+          <w:lang w:val="uk-UA"/>
+        </w:rPr>
+        <w:t>```powershell</w:t>
+      </w:r>
+    </w:p>
+    <w:p>
+      <w:pPr>
+        <w:rPr>
+          <w:lang w:val="uk-UA"/>
+        </w:rPr>
+      </w:pPr>
+      <w:r>
+        <w:rPr>
+          <w:lang w:val="uk-UA"/>
+        </w:rPr>
+        <w:t>python -m venv .venv</w:t>
+      </w:r>
+    </w:p>
+    <w:p>
+      <w:pPr>
+        <w:rPr>
+          <w:lang w:val="uk-UA"/>
+        </w:rPr>
+      </w:pPr>
+      <w:r>
+        <w:rPr>
+          <w:lang w:val="uk-UA"/>
+        </w:rPr>
+        <w:t>.\.venv\Scripts\Activate.ps1</w:t>
+      </w:r>
+    </w:p>
+    <w:p>
+      <w:pPr>
+        <w:pStyle w:val="2"/>
+      </w:pPr>
+      <w:r>
+        <w:t>4.</w:t>
+      </w:r>
+      <w:r>
+        <w:rPr>
+          <w:lang w:val="uk-UA"/>
+        </w:rPr>
+        <w:t>1</w:t>
+      </w:r>
+      <w:r>
+        <w:rPr>
+          <w:lang w:val="uk-UA"/>
+        </w:rPr>
+        <w:t>4</w:t>
+      </w:r>
+      <w:r>
+        <w:t>.</w:t>
+      </w:r>
+      <w:r>
+        <w:t xml:space="preserve"> </w:t>
+      </w:r>
+      <w:r>
+        <w:t>pyproject.toml</w:t>
+      </w:r>
+    </w:p>
+    <w:p>
+      <w:r>
+        <w:t>[build-system]</w:t>
+      </w:r>
+    </w:p>
+    <w:p>
+      <w:r>
+        <w:t>requires = ["setuptools&gt;=61.0"]</w:t>
+      </w:r>
+    </w:p>
+    <w:p>
+      <w:r>
+        <w:t>build-backend = "setuptools.build_meta"</w:t>
+      </w:r>
+    </w:p>
+    <w:p/>
+    <w:p>
+      <w:r>
+        <w:t>[project]</w:t>
+      </w:r>
+    </w:p>
+    <w:p>
+      <w:r>
+        <w:t>name = "shop"</w:t>
+      </w:r>
+    </w:p>
+    <w:p>
+      <w:r>
+        <w:t>version = "0.1.0"</w:t>
+      </w:r>
+    </w:p>
+    <w:p>
+      <w:r>
+        <w:t>description = "E-Commerce domain system for Lab 06 (Option 3)"</w:t>
+      </w:r>
+    </w:p>
+    <w:p>
+      <w:r>
+        <w:t>authors = [{ name = "Maksym Filias" }]</w:t>
+      </w:r>
+    </w:p>
+    <w:p>
+      <w:r>
+        <w:t>dependencies = []</w:t>
+      </w:r>
+    </w:p>
+    <w:p/>
+    <w:p>
+      <w:r>
+        <w:t>[project.optional-dependencies]</w:t>
+      </w:r>
+    </w:p>
+    <w:p>
+      <w:r>
+        <w:t>dev = [</w:t>
+      </w:r>
+    </w:p>
+    <w:p>
+      <w:r>
+        <w:t xml:space="preserve">    "pytest&gt;=8.0.0",</w:t>
+      </w:r>
+    </w:p>
+    <w:p>
+      <w:r>
+        <w:lastRenderedPageBreak/>
+        <w:t xml:space="preserve">    "pytest-cov&gt;=5.0.0",</w:t>
+      </w:r>
+    </w:p>
+    <w:p>
+      <w:r>
+        <w:t xml:space="preserve">    "pytest-asyncio&gt;=0.23.0",</w:t>
+      </w:r>
+    </w:p>
+    <w:p>
+      <w:r>
+        <w:t>]</w:t>
+      </w:r>
+    </w:p>
+    <w:p/>
+    <w:p>
+      <w:r>
+        <w:t>[tool.pytest.ini_options]</w:t>
+      </w:r>
+    </w:p>
+    <w:p>
+      <w:r>
+        <w:t>testpaths = ["tests"]</w:t>
+      </w:r>
+    </w:p>
+    <w:p>
+      <w:r>
+        <w:t>pythonpath = ["src"]</w:t>
+      </w:r>
+    </w:p>
+    <w:p>
+      <w:r>
+        <w:t>addopts = "-ra -v --strict-markers --cov=application --cov-branch --cov-report=term-missing"</w:t>
+      </w:r>
+    </w:p>
+    <w:p>
+      <w:r>
+        <w:t>markers = [</w:t>
+      </w:r>
+    </w:p>
+    <w:p>
+      <w:r>
+        <w:t xml:space="preserve">    "integration: integration tests suite",</w:t>
+      </w:r>
+    </w:p>
+    <w:p>
+      <w:r>
+        <w:t>]</w:t>
+      </w:r>
+    </w:p>
+    <w:p/>
+    <w:p>
+      <w:r>
+        <w:t>[tool.coverage.run]</w:t>
+      </w:r>
+    </w:p>
+    <w:p>
+      <w:r>
+        <w:t>branch = true</w:t>
+      </w:r>
+    </w:p>
+    <w:p>
+      <w:r>
+        <w:t>source = ["application"]</w:t>
+      </w:r>
+    </w:p>
+    <w:p/>
+    <w:p>
+      <w:r>
+        <w:t>[tool.coverage.report]</w:t>
+      </w:r>
+    </w:p>
+    <w:p>
+      <w:r>
+        <w:t>show_missing = true</w:t>
+      </w:r>
+    </w:p>
+    <w:p>
+      <w:r>
+        <w:t>skip_covered = false</w:t>
+      </w:r>
+    </w:p>
+    <w:p>
+      <w:r>
+        <w:t>fail_under = 80.0</w:t>
+      </w:r>
     </w:p>
     <w:p>
       <w:pPr>
@@ -30873,6 +31377,7 @@
           <w:szCs w:val="17"/>
           <w:lang w:val="uk-UA"/>
         </w:rPr>
+        <w:lastRenderedPageBreak/>
         <w:t>configfile: pyproject.toml</w:t>
       </w:r>
     </w:p>
@@ -31320,6 +31825,7 @@
           <w:szCs w:val="17"/>
           <w:lang w:val="uk-UA"/>
         </w:rPr>
+        <w:lastRenderedPageBreak/>
         <w:t>tests/unit/test_validators.py::test_invalid_product_data_raises_exception[-Electronics-100.0-10] PASSED                                                 [ 86%]</w:t>
       </w:r>
     </w:p>
@@ -31377,7 +31883,6 @@
           <w:szCs w:val="17"/>
           <w:lang w:val="uk-UA"/>
         </w:rPr>
-        <w:lastRenderedPageBreak/>
         <w:t>tests/unit/test_validators.py::test_invalid_product_data_raises_exception[Phone-Electronics-100.0--5] PASSED                                            [100%]</w:t>
       </w:r>
     </w:p>
@@ -31833,6 +32338,7 @@
           <w:szCs w:val="17"/>
           <w:lang w:val="uk-UA"/>
         </w:rPr>
+        <w:lastRenderedPageBreak/>
         <w:t>platform win32 -- Python 3.13.0, pytest-9.1.1, pluggy-1.7.0 -- C:\Users\userPC\Desktop\3 курс 1 сем\проф. пайтон\LAB_06\.venv\Scripts\python.exe</w:t>
       </w:r>
     </w:p>
@@ -31923,7 +32429,6 @@
           <w:szCs w:val="17"/>
           <w:lang w:val="uk-UA"/>
         </w:rPr>
-        <w:lastRenderedPageBreak/>
         <w:t>plugins: asyncio-1.4.0, cov-7.1.0</w:t>
       </w:r>
     </w:p>
@@ -32985,6 +33490,7 @@
           <w:szCs w:val="26"/>
           <w:lang w:val="uk-UA"/>
         </w:rPr>
+        <w:lastRenderedPageBreak/>
         <w:t>9</w:t>
       </w:r>
       <w:r>

</xml_diff>